<commit_message>
Ping Pong Tanks: ratkaise tehtävänannon ristiriidat
Jokaisella kierroksella on uusi sokkelo (uusi osa 40-3:n loppuun). Viikolla 40
valittu tietovarasto koskee myös power-upeja; ScriptableObject on ehdotus.
T13–T14 testaavat priorisoinnissa valittua ominaisuutta. Tilaaja katselmoi
viikolla 43. Palaverin sopimukset aina issueihin, erillinen muistio vain kun
työvaihe pyytää. Julkiseen repoon vain roolit; ohjaaja on tilaaja.
Osatehtävien järjestys ennallaan: uudet osat vain loppuun.

Co-Authored-By: Claude Opus 5.5 <noreply@anthropic.com>
</commit_message>
<xml_diff>
--- a/downloads/opettajan-projektisuunnitelma.docx
+++ b/downloads/opettajan-projektisuunnitelma.docx
@@ -221,7 +221,7 @@
                 <w:sz w:val="19"/>
                 <w:szCs w:val="19"/>
               </w:rPr>
-              <w:t xml:space="preserve">Rajaa P0:n viikolla 36, vastaa avoimiin asioihin (Unity-versio, lisenssi, julkaisukanava, tekijänimi), katselmoi viikoilla 43 ja 47, tarkistaa laadun tarkistuspisteissä.</w:t>
+              <w:t xml:space="preserve">Rajaa P0:n viikolla 36, vastaa avoimiin asioihin (Unity-versio, lisenssi, julkaisukanava, tekijänimi), katselmoi pelin tilaajana viikolla 43 (viikolla 47 julkaisuehdokkaan testaa ulkopuolinen testaaja, ei tilaaja), tarkistaa laadun tarkistuspisteissä.</w:t>
             </w:r>
           </w:p>
         </w:tc>
@@ -272,7 +272,7 @@
                 <w:sz w:val="19"/>
                 <w:szCs w:val="19"/>
               </w:rPr>
-              <w:t xml:space="preserve">Viikkopalaverit, playtestit viikoilla 39/44, debug-pari viikolla 45. Nimet kirjataan toteutussuunnitelmaan viikolla 36.</w:t>
+              <w:t xml:space="preserve">Viikkopalaverit, playtestit viikoilla 39/44, debug-pari viikolla 45. Julkiseen repoon ja toteutussuunnitelmaan kirjataan vain roolit (pelitiimin jäsen A ja B); nimet opiskelija lähettää tarvittaessa ohjaajalle Teamsissa.</w:t>
             </w:r>
           </w:p>
         </w:tc>

</xml_diff>